<commit_message>
Added solver for lumens and wattages for efficient lighting
</commit_message>
<xml_diff>
--- a/Addition-newest.docx
+++ b/Addition-newest.docx
@@ -1,6 +1,6 @@
 
 <file path=word/document.xml><?xml version="1.0" encoding="utf-8"?>
-<w:document xmlns:wpc="http://schemas.microsoft.com/office/word/2010/wordprocessingCanvas" xmlns:cx="http://schemas.microsoft.com/office/drawing/2014/chartex" xmlns:cx1="http://schemas.microsoft.com/office/drawing/2015/9/8/chartex" xmlns:cx2="http://schemas.microsoft.com/office/drawing/2015/10/21/chartex" xmlns:cx3="http://schemas.microsoft.com/office/drawing/2016/5/9/chartex" xmlns:cx4="http://schemas.microsoft.com/office/drawing/2016/5/10/chartex" xmlns:cx5="http://schemas.microsoft.com/office/drawing/2016/5/11/chartex" xmlns:cx6="http://schemas.microsoft.com/office/drawing/2016/5/12/chartex" xmlns:cx7="http://schemas.microsoft.com/office/drawing/2016/5/13/chartex" xmlns:cx8="http://schemas.microsoft.com/office/drawing/2016/5/14/chartex" xmlns:mc="http://schemas.openxmlformats.org/markup-compatibility/2006" xmlns:aink="http://schemas.microsoft.com/office/drawing/2016/ink" xmlns:am3d="http://schemas.microsoft.com/office/drawing/2017/model3d" xmlns:o="urn:schemas-microsoft-com:office:office" xmlns:r="http://schemas.openxmlformats.org/officeDocument/2006/relationships" xmlns:m="http://schemas.openxmlformats.org/officeDocument/2006/math" xmlns:v="urn:schemas-microsoft-com:vml" xmlns:wp14="http://schemas.microsoft.com/office/word/2010/wordprocessingDrawing" xmlns:wp="http://schemas.openxmlformats.org/drawingml/2006/wordprocessingDrawing" xmlns:w10="urn:schemas-microsoft-com:office:word" xmlns:w="http://schemas.openxmlformats.org/wordprocessingml/2006/main" xmlns:w14="http://schemas.microsoft.com/office/word/2010/wordml" xmlns:w15="http://schemas.microsoft.com/office/word/2012/wordml" xmlns:w16cex="http://schemas.microsoft.com/office/word/2018/wordml/cex" xmlns:w16cid="http://schemas.microsoft.com/office/word/2016/wordml/cid" xmlns:w16="http://schemas.microsoft.com/office/word/2018/wordml" xmlns:w16sdtdh="http://schemas.microsoft.com/office/word/2020/wordml/sdtdatahash" xmlns:w16se="http://schemas.microsoft.com/office/word/2015/wordml/symex" xmlns:wpg="http://schemas.microsoft.com/office/word/2010/wordprocessingGroup" xmlns:wpi="http://schemas.microsoft.com/office/word/2010/wordprocessingInk" xmlns:wne="http://schemas.microsoft.com/office/word/2006/wordml" xmlns:wps="http://schemas.microsoft.com/office/word/2010/wordprocessingShape" mc:Ignorable="w14 w15 w16se w16cid w16 w16cex w16sdtdh wp14">
+<w:document xmlns:wpc="http://schemas.microsoft.com/office/word/2010/wordprocessingCanvas" xmlns:cx="http://schemas.microsoft.com/office/drawing/2014/chartex" xmlns:cx1="http://schemas.microsoft.com/office/drawing/2015/9/8/chartex" xmlns:cx2="http://schemas.microsoft.com/office/drawing/2015/10/21/chartex" xmlns:cx3="http://schemas.microsoft.com/office/drawing/2016/5/9/chartex" xmlns:cx4="http://schemas.microsoft.com/office/drawing/2016/5/10/chartex" xmlns:cx5="http://schemas.microsoft.com/office/drawing/2016/5/11/chartex" xmlns:cx6="http://schemas.microsoft.com/office/drawing/2016/5/12/chartex" xmlns:cx7="http://schemas.microsoft.com/office/drawing/2016/5/13/chartex" xmlns:cx8="http://schemas.microsoft.com/office/drawing/2016/5/14/chartex" xmlns:mc="http://schemas.openxmlformats.org/markup-compatibility/2006" xmlns:aink="http://schemas.microsoft.com/office/drawing/2016/ink" xmlns:am3d="http://schemas.microsoft.com/office/drawing/2017/model3d" xmlns:o="urn:schemas-microsoft-com:office:office" xmlns:oel="http://schemas.microsoft.com/office/2019/extlst" xmlns:r="http://schemas.openxmlformats.org/officeDocument/2006/relationships" xmlns:m="http://schemas.openxmlformats.org/officeDocument/2006/math" xmlns:v="urn:schemas-microsoft-com:vml" xmlns:wp14="http://schemas.microsoft.com/office/word/2010/wordprocessingDrawing" xmlns:wp="http://schemas.openxmlformats.org/drawingml/2006/wordprocessingDrawing" xmlns:w10="urn:schemas-microsoft-com:office:word" xmlns:w="http://schemas.openxmlformats.org/wordprocessingml/2006/main" xmlns:w14="http://schemas.microsoft.com/office/word/2010/wordml" xmlns:w15="http://schemas.microsoft.com/office/word/2012/wordml" xmlns:w16cex="http://schemas.microsoft.com/office/word/2018/wordml/cex" xmlns:w16cid="http://schemas.microsoft.com/office/word/2016/wordml/cid" xmlns:w16="http://schemas.microsoft.com/office/word/2018/wordml" xmlns:w16du="http://schemas.microsoft.com/office/word/2023/wordml/word16du" xmlns:w16sdtdh="http://schemas.microsoft.com/office/word/2020/wordml/sdtdatahash" xmlns:w16sdtfl="http://schemas.microsoft.com/office/word/2024/wordml/sdtformatlock" xmlns:w16se="http://schemas.microsoft.com/office/word/2015/wordml/symex" xmlns:wpg="http://schemas.microsoft.com/office/word/2010/wordprocessingGroup" xmlns:wpi="http://schemas.microsoft.com/office/word/2010/wordprocessingInk" xmlns:wne="http://schemas.microsoft.com/office/word/2006/wordml" xmlns:wps="http://schemas.microsoft.com/office/word/2010/wordprocessingShape" mc:Ignorable="w14 w15 w16se w16cid w16 w16cex w16sdtdh w16sdtfl w16du wp14">
   <w:body>
     <w:p>
       <w:pPr>
@@ -23,6 +23,46 @@
         <w:pStyle w:val="Heading2"/>
       </w:pPr>
       <w:bookmarkStart w:id="3" w:name="_Hlk504256192"/>
+      <w:r>
+        <w:t>Release Note (3.21, May 2025)</w:t>
+      </w:r>
+    </w:p>
+    <w:p>
+      <w:pPr>
+        <w:pStyle w:val="Heading3"/>
+      </w:pPr>
+      <w:r>
+        <w:t>More conversions for length and lumens</w:t>
+      </w:r>
+    </w:p>
+    <w:p>
+      <w:r>
+        <w:t>The length conversions now include Lego brand building block size information and astronomy distances</w:t>
+      </w:r>
+    </w:p>
+    <w:p>
+      <w:r>
+        <w:t>There’s a new Lumens converter to convert Lumens (brightness) to typical wattages. This lets you easily see for any given incandescent bulb wattage what the approximate equivalent would be for an LED light (plus a few others like high-pressure sodium lights)</w:t>
+      </w:r>
+    </w:p>
+    <w:p>
+      <w:pPr>
+        <w:pStyle w:val="Heading3"/>
+      </w:pPr>
+      <w:r>
+        <w:t>Unicode tables are updated to the latest standard</w:t>
+      </w:r>
+    </w:p>
+    <w:p>
+      <w:r>
+        <w:t>The Unicode tables now reflects the latest 2021 Unicode set.</w:t>
+      </w:r>
+    </w:p>
+    <w:p/>
+    <w:p>
+      <w:pPr>
+        <w:pStyle w:val="Heading2"/>
+      </w:pPr>
       <w:r>
         <w:t>Release Notes</w:t>
       </w:r>
@@ -307,7 +347,6 @@
           </w:p>
           <w:p>
             <w:r>
-              <w:lastRenderedPageBreak/>
               <w:t xml:space="preserve">SetupDistance(“function”, </w:t>
             </w:r>
             <w:r>
@@ -322,7 +361,6 @@
     </w:tbl>
     <w:p>
       <w:r>
-        <w:lastRenderedPageBreak/>
         <w:t>Example: complete program to graph Light data</w:t>
       </w:r>
     </w:p>
@@ -337,7 +375,7 @@
           <w:noProof/>
         </w:rPr>
         <w:drawing>
-          <wp:anchor distT="0" distB="0" distL="114300" distR="114300" simplePos="0" relativeHeight="251659264" behindDoc="0" locked="0" layoutInCell="1" allowOverlap="1" wp14:anchorId="3F236576" wp14:editId="332FD85C">
+          <wp:anchor distT="0" distB="0" distL="114300" distR="114300" simplePos="0" relativeHeight="251659264" behindDoc="0" locked="0" layoutInCell="1" allowOverlap="1" wp14:anchorId="3F236576" wp14:editId="7FCD533D">
             <wp:simplePos x="0" y="0"/>
             <wp:positionH relativeFrom="margin">
               <wp:align>left</wp:align>
@@ -970,7 +1008,7 @@
 </file>
 
 <file path=word/numbering.xml><?xml version="1.0" encoding="utf-8"?>
-<w:numbering xmlns:wpc="http://schemas.microsoft.com/office/word/2010/wordprocessingCanvas" xmlns:cx="http://schemas.microsoft.com/office/drawing/2014/chartex" xmlns:cx1="http://schemas.microsoft.com/office/drawing/2015/9/8/chartex" xmlns:cx2="http://schemas.microsoft.com/office/drawing/2015/10/21/chartex" xmlns:cx3="http://schemas.microsoft.com/office/drawing/2016/5/9/chartex" xmlns:cx4="http://schemas.microsoft.com/office/drawing/2016/5/10/chartex" xmlns:cx5="http://schemas.microsoft.com/office/drawing/2016/5/11/chartex" xmlns:cx6="http://schemas.microsoft.com/office/drawing/2016/5/12/chartex" xmlns:cx7="http://schemas.microsoft.com/office/drawing/2016/5/13/chartex" xmlns:cx8="http://schemas.microsoft.com/office/drawing/2016/5/14/chartex" xmlns:mc="http://schemas.openxmlformats.org/markup-compatibility/2006" xmlns:aink="http://schemas.microsoft.com/office/drawing/2016/ink" xmlns:am3d="http://schemas.microsoft.com/office/drawing/2017/model3d" xmlns:o="urn:schemas-microsoft-com:office:office" xmlns:r="http://schemas.openxmlformats.org/officeDocument/2006/relationships" xmlns:m="http://schemas.openxmlformats.org/officeDocument/2006/math" xmlns:v="urn:schemas-microsoft-com:vml" xmlns:wp14="http://schemas.microsoft.com/office/word/2010/wordprocessingDrawing" xmlns:wp="http://schemas.openxmlformats.org/drawingml/2006/wordprocessingDrawing" xmlns:w10="urn:schemas-microsoft-com:office:word" xmlns:w="http://schemas.openxmlformats.org/wordprocessingml/2006/main" xmlns:w14="http://schemas.microsoft.com/office/word/2010/wordml" xmlns:w15="http://schemas.microsoft.com/office/word/2012/wordml" xmlns:w16cex="http://schemas.microsoft.com/office/word/2018/wordml/cex" xmlns:w16cid="http://schemas.microsoft.com/office/word/2016/wordml/cid" xmlns:w16="http://schemas.microsoft.com/office/word/2018/wordml" xmlns:w16sdtdh="http://schemas.microsoft.com/office/word/2020/wordml/sdtdatahash" xmlns:w16se="http://schemas.microsoft.com/office/word/2015/wordml/symex" xmlns:wpg="http://schemas.microsoft.com/office/word/2010/wordprocessingGroup" xmlns:wpi="http://schemas.microsoft.com/office/word/2010/wordprocessingInk" xmlns:wne="http://schemas.microsoft.com/office/word/2006/wordml" xmlns:wps="http://schemas.microsoft.com/office/word/2010/wordprocessingShape" mc:Ignorable="w14 w15 w16se w16cid w16 w16cex w16sdtdh wp14">
+<w:numbering xmlns:wpc="http://schemas.microsoft.com/office/word/2010/wordprocessingCanvas" xmlns:cx="http://schemas.microsoft.com/office/drawing/2014/chartex" xmlns:cx1="http://schemas.microsoft.com/office/drawing/2015/9/8/chartex" xmlns:cx2="http://schemas.microsoft.com/office/drawing/2015/10/21/chartex" xmlns:cx3="http://schemas.microsoft.com/office/drawing/2016/5/9/chartex" xmlns:cx4="http://schemas.microsoft.com/office/drawing/2016/5/10/chartex" xmlns:cx5="http://schemas.microsoft.com/office/drawing/2016/5/11/chartex" xmlns:cx6="http://schemas.microsoft.com/office/drawing/2016/5/12/chartex" xmlns:cx7="http://schemas.microsoft.com/office/drawing/2016/5/13/chartex" xmlns:cx8="http://schemas.microsoft.com/office/drawing/2016/5/14/chartex" xmlns:mc="http://schemas.openxmlformats.org/markup-compatibility/2006" xmlns:aink="http://schemas.microsoft.com/office/drawing/2016/ink" xmlns:am3d="http://schemas.microsoft.com/office/drawing/2017/model3d" xmlns:o="urn:schemas-microsoft-com:office:office" xmlns:oel="http://schemas.microsoft.com/office/2019/extlst" xmlns:r="http://schemas.openxmlformats.org/officeDocument/2006/relationships" xmlns:m="http://schemas.openxmlformats.org/officeDocument/2006/math" xmlns:v="urn:schemas-microsoft-com:vml" xmlns:wp14="http://schemas.microsoft.com/office/word/2010/wordprocessingDrawing" xmlns:wp="http://schemas.openxmlformats.org/drawingml/2006/wordprocessingDrawing" xmlns:w10="urn:schemas-microsoft-com:office:word" xmlns:w="http://schemas.openxmlformats.org/wordprocessingml/2006/main" xmlns:w14="http://schemas.microsoft.com/office/word/2010/wordml" xmlns:w15="http://schemas.microsoft.com/office/word/2012/wordml" xmlns:w16cex="http://schemas.microsoft.com/office/word/2018/wordml/cex" xmlns:w16cid="http://schemas.microsoft.com/office/word/2016/wordml/cid" xmlns:w16="http://schemas.microsoft.com/office/word/2018/wordml" xmlns:w16du="http://schemas.microsoft.com/office/word/2023/wordml/word16du" xmlns:w16sdtdh="http://schemas.microsoft.com/office/word/2020/wordml/sdtdatahash" xmlns:w16sdtfl="http://schemas.microsoft.com/office/word/2024/wordml/sdtformatlock" xmlns:w16se="http://schemas.microsoft.com/office/word/2015/wordml/symex" xmlns:wpg="http://schemas.microsoft.com/office/word/2010/wordprocessingGroup" xmlns:wpi="http://schemas.microsoft.com/office/word/2010/wordprocessingInk" xmlns:wne="http://schemas.microsoft.com/office/word/2006/wordml" xmlns:wps="http://schemas.microsoft.com/office/word/2010/wordprocessingShape" mc:Ignorable="w14 w15 w16se w16cid w16 w16cex w16sdtdh w16sdtfl w16du wp14">
   <w:abstractNum w:abstractNumId="0" w15:restartNumberingAfterBreak="0">
     <w:nsid w:val="1482775B"/>
     <w:multiLevelType w:val="multilevel"/>
@@ -1833,35 +1871,35 @@
       </w:rPr>
     </w:lvl>
   </w:abstractNum>
-  <w:num w:numId="1">
+  <w:num w:numId="1" w16cid:durableId="2097701130">
     <w:abstractNumId w:val="0"/>
   </w:num>
-  <w:num w:numId="2">
+  <w:num w:numId="2" w16cid:durableId="686711486">
     <w:abstractNumId w:val="3"/>
   </w:num>
-  <w:num w:numId="3">
+  <w:num w:numId="3" w16cid:durableId="1103570589">
     <w:abstractNumId w:val="2"/>
   </w:num>
-  <w:num w:numId="4">
+  <w:num w:numId="4" w16cid:durableId="1226918505">
     <w:abstractNumId w:val="5"/>
   </w:num>
-  <w:num w:numId="5">
+  <w:num w:numId="5" w16cid:durableId="1383286184">
     <w:abstractNumId w:val="7"/>
   </w:num>
-  <w:num w:numId="6">
+  <w:num w:numId="6" w16cid:durableId="171184006">
     <w:abstractNumId w:val="6"/>
   </w:num>
-  <w:num w:numId="7">
+  <w:num w:numId="7" w16cid:durableId="1785733143">
     <w:abstractNumId w:val="1"/>
   </w:num>
-  <w:num w:numId="8">
+  <w:num w:numId="8" w16cid:durableId="1191721013">
     <w:abstractNumId w:val="4"/>
   </w:num>
 </w:numbering>
 </file>
 
 <file path=word/styles.xml><?xml version="1.0" encoding="utf-8"?>
-<w:styles xmlns:mc="http://schemas.openxmlformats.org/markup-compatibility/2006" xmlns:r="http://schemas.openxmlformats.org/officeDocument/2006/relationships" xmlns:w="http://schemas.openxmlformats.org/wordprocessingml/2006/main" xmlns:w14="http://schemas.microsoft.com/office/word/2010/wordml" xmlns:w15="http://schemas.microsoft.com/office/word/2012/wordml" xmlns:w16cex="http://schemas.microsoft.com/office/word/2018/wordml/cex" xmlns:w16cid="http://schemas.microsoft.com/office/word/2016/wordml/cid" xmlns:w16="http://schemas.microsoft.com/office/word/2018/wordml" xmlns:w16sdtdh="http://schemas.microsoft.com/office/word/2020/wordml/sdtdatahash" xmlns:w16se="http://schemas.microsoft.com/office/word/2015/wordml/symex" mc:Ignorable="w14 w15 w16se w16cid w16 w16cex w16sdtdh">
+<w:styles xmlns:mc="http://schemas.openxmlformats.org/markup-compatibility/2006" xmlns:r="http://schemas.openxmlformats.org/officeDocument/2006/relationships" xmlns:w="http://schemas.openxmlformats.org/wordprocessingml/2006/main" xmlns:w14="http://schemas.microsoft.com/office/word/2010/wordml" xmlns:w15="http://schemas.microsoft.com/office/word/2012/wordml" xmlns:w16cex="http://schemas.microsoft.com/office/word/2018/wordml/cex" xmlns:w16cid="http://schemas.microsoft.com/office/word/2016/wordml/cid" xmlns:w16="http://schemas.microsoft.com/office/word/2018/wordml" xmlns:w16du="http://schemas.microsoft.com/office/word/2023/wordml/word16du" xmlns:w16sdtdh="http://schemas.microsoft.com/office/word/2020/wordml/sdtdatahash" xmlns:w16sdtfl="http://schemas.microsoft.com/office/word/2024/wordml/sdtformatlock" xmlns:w16se="http://schemas.microsoft.com/office/word/2015/wordml/symex" mc:Ignorable="w14 w15 w16se w16cid w16 w16cex w16sdtdh w16sdtfl w16du">
   <w:docDefaults>
     <w:rPrDefault>
       <w:rPr>
@@ -2258,7 +2296,7 @@
   <w:style w:type="paragraph" w:default="1" w:styleId="Normal">
     <w:name w:val="Normal"/>
     <w:qFormat/>
-    <w:rsid w:val="009C57E7"/>
+    <w:rsid w:val="00773D1A"/>
   </w:style>
   <w:style w:type="paragraph" w:styleId="Heading1">
     <w:name w:val="heading 1"/>

</xml_diff>

<commit_message>
Updated manual New volume converter and icon Removed unneeded #using from all page controls
</commit_message>
<xml_diff>
--- a/Addition-newest.docx
+++ b/Addition-newest.docx
@@ -42,7 +42,17 @@
     </w:p>
     <w:p>
       <w:r>
+        <w:t>The weight conversions include fabric weights to convert between grams-per-square-meter (GSM) and ounces pers square yard.</w:t>
+      </w:r>
+    </w:p>
+    <w:p>
+      <w:r>
         <w:t>There’s a new Lumens converter to convert Lumens (brightness) to typical wattages. This lets you easily see for any given incandescent bulb wattage what the approximate equivalent would be for an LED light (plus a few others like high-pressure sodium lights)</w:t>
+      </w:r>
+    </w:p>
+    <w:p>
+      <w:r>
+        <w:t>There’s a new Volume converter that convert common garden unit like cubic feet and cubic yards into metric.</w:t>
       </w:r>
     </w:p>
     <w:p>
@@ -146,13 +156,26 @@
       <w:pPr>
         <w:pStyle w:val="Heading3"/>
       </w:pPr>
-      <w:r>
-        <w:t>Gopher.Start(..., port)</w:t>
-      </w:r>
-    </w:p>
-    <w:p>
-      <w:r>
-        <w:t>The Gopher.Start method now takes an addition port number as a parameter.</w:t>
+      <w:proofErr w:type="spellStart"/>
+      <w:r>
+        <w:t>Gopher.Start</w:t>
+      </w:r>
+      <w:proofErr w:type="spellEnd"/>
+      <w:r>
+        <w:t>(..., port)</w:t>
+      </w:r>
+    </w:p>
+    <w:p>
+      <w:r>
+        <w:t xml:space="preserve">The </w:t>
+      </w:r>
+      <w:proofErr w:type="spellStart"/>
+      <w:r>
+        <w:t>Gopher.Start</w:t>
+      </w:r>
+      <w:proofErr w:type="spellEnd"/>
+      <w:r>
+        <w:t xml:space="preserve"> method now takes an addition port number as a parameter.</w:t>
       </w:r>
       <w:r>
         <w:t xml:space="preserve"> Normally the Gopher server is on port 70; you can set it to any other internet port number.</w:t>
@@ -222,8 +245,13 @@
           </wp:anchor>
         </w:drawing>
       </w:r>
-      <w:r>
-        <w:t xml:space="preserve">Skoobot </w:t>
+      <w:proofErr w:type="spellStart"/>
+      <w:r>
+        <w:t>Skoobot</w:t>
+      </w:r>
+      <w:proofErr w:type="spellEnd"/>
+      <w:r>
+        <w:t xml:space="preserve"> </w:t>
       </w:r>
       <w:r>
         <w:t>updates</w:t>
@@ -234,7 +262,15 @@
     </w:p>
     <w:p>
       <w:r>
-        <w:t xml:space="preserve">The Skoobot is a tiny Bluetooth-controllable robot </w:t>
+        <w:t xml:space="preserve">The </w:t>
+      </w:r>
+      <w:proofErr w:type="spellStart"/>
+      <w:r>
+        <w:t>Skoobot</w:t>
+      </w:r>
+      <w:proofErr w:type="spellEnd"/>
+      <w:r>
+        <w:t xml:space="preserve"> is a tiny Bluetooth-controllable robot </w:t>
       </w:r>
       <w:bookmarkStart w:id="8" w:name="_Hlk8802715"/>
       <w:r>
@@ -263,7 +299,15 @@
     <w:bookmarkEnd w:id="6"/>
     <w:p>
       <w:r>
-        <w:t xml:space="preserve">New in this release: the Skoobot specialization can provide a stream of distance and light values. You just have to pass in the function you want called and the number of milliseconds between callbacks. </w:t>
+        <w:t xml:space="preserve">New in this release: the </w:t>
+      </w:r>
+      <w:proofErr w:type="spellStart"/>
+      <w:r>
+        <w:t>Skoobot</w:t>
+      </w:r>
+      <w:proofErr w:type="spellEnd"/>
+      <w:r>
+        <w:t xml:space="preserve"> specialization can provide a stream of distance and light values. You just have to pass in the function you want called and the number of milliseconds between callbacks. </w:t>
       </w:r>
     </w:p>
     <w:p>
@@ -335,23 +379,37 @@
             <w:tcW w:w="3775" w:type="dxa"/>
           </w:tcPr>
           <w:p>
+            <w:proofErr w:type="spellStart"/>
             <w:r>
-              <w:t xml:space="preserve">SetupLight(“function”, </w:t>
+              <w:t>SetupLight</w:t>
             </w:r>
+            <w:proofErr w:type="spellEnd"/>
+            <w:r>
+              <w:t xml:space="preserve">(“function”, </w:t>
+            </w:r>
+            <w:proofErr w:type="spellStart"/>
             <w:r>
               <w:t>ms</w:t>
             </w:r>
+            <w:proofErr w:type="spellEnd"/>
             <w:r>
               <w:t>)</w:t>
             </w:r>
           </w:p>
           <w:p>
+            <w:proofErr w:type="spellStart"/>
             <w:r>
-              <w:t xml:space="preserve">SetupDistance(“function”, </w:t>
+              <w:t>SetupDistance</w:t>
             </w:r>
+            <w:proofErr w:type="spellEnd"/>
+            <w:r>
+              <w:t xml:space="preserve">(“function”, </w:t>
+            </w:r>
+            <w:proofErr w:type="spellStart"/>
             <w:r>
               <w:t>ms</w:t>
             </w:r>
+            <w:proofErr w:type="spellEnd"/>
             <w:r>
               <w:t>)</w:t>
             </w:r>
@@ -375,7 +433,7 @@
           <w:noProof/>
         </w:rPr>
         <w:drawing>
-          <wp:anchor distT="0" distB="0" distL="114300" distR="114300" simplePos="0" relativeHeight="251659264" behindDoc="0" locked="0" layoutInCell="1" allowOverlap="1" wp14:anchorId="3F236576" wp14:editId="7FCD533D">
+          <wp:anchor distT="0" distB="0" distL="114300" distR="114300" simplePos="0" relativeHeight="251659264" behindDoc="0" locked="0" layoutInCell="1" allowOverlap="1" wp14:anchorId="3F236576" wp14:editId="492F726A">
             <wp:simplePos x="0" y="0"/>
             <wp:positionH relativeFrom="margin">
               <wp:align>left</wp:align>
@@ -473,7 +531,15 @@
         <w:pStyle w:val="Code"/>
       </w:pPr>
       <w:r>
-        <w:t>REM Pick a Skoobot. If there's only one, select it</w:t>
+        <w:t xml:space="preserve">REM Pick a </w:t>
+      </w:r>
+      <w:proofErr w:type="spellStart"/>
+      <w:r>
+        <w:t>Skoobot</w:t>
+      </w:r>
+      <w:proofErr w:type="spellEnd"/>
+      <w:r>
+        <w:t>. If there's only one, select it</w:t>
       </w:r>
     </w:p>
     <w:p>
@@ -497,23 +563,55 @@
         <w:pStyle w:val="Code"/>
       </w:pPr>
       <w:r>
-        <w:t>devices = Bluetooth.DevicesName("Skoobot*")</w:t>
-      </w:r>
-    </w:p>
-    <w:p>
-      <w:pPr>
-        <w:pStyle w:val="Code"/>
-      </w:pPr>
-      <w:r>
-        <w:t>IF (devices.Count = 0)</w:t>
-      </w:r>
-    </w:p>
-    <w:p>
-      <w:pPr>
-        <w:pStyle w:val="Code"/>
-      </w:pPr>
-      <w:r>
-        <w:t xml:space="preserve">    PRINT "No Skoobot devices found!"</w:t>
+        <w:t xml:space="preserve">devices = </w:t>
+      </w:r>
+      <w:proofErr w:type="spellStart"/>
+      <w:r>
+        <w:t>Bluetooth.DevicesName</w:t>
+      </w:r>
+      <w:proofErr w:type="spellEnd"/>
+      <w:r>
+        <w:t>("</w:t>
+      </w:r>
+      <w:proofErr w:type="spellStart"/>
+      <w:r>
+        <w:t>Skoobot</w:t>
+      </w:r>
+      <w:proofErr w:type="spellEnd"/>
+      <w:r>
+        <w:t>*")</w:t>
+      </w:r>
+    </w:p>
+    <w:p>
+      <w:pPr>
+        <w:pStyle w:val="Code"/>
+      </w:pPr>
+      <w:r>
+        <w:t>IF (</w:t>
+      </w:r>
+      <w:proofErr w:type="spellStart"/>
+      <w:r>
+        <w:t>devices.Count</w:t>
+      </w:r>
+      <w:proofErr w:type="spellEnd"/>
+      <w:r>
+        <w:t xml:space="preserve"> = 0)</w:t>
+      </w:r>
+    </w:p>
+    <w:p>
+      <w:pPr>
+        <w:pStyle w:val="Code"/>
+      </w:pPr>
+      <w:r>
+        <w:t xml:space="preserve">    PRINT "No </w:t>
+      </w:r>
+      <w:proofErr w:type="spellStart"/>
+      <w:r>
+        <w:t>Skoobot</w:t>
+      </w:r>
+      <w:proofErr w:type="spellEnd"/>
+      <w:r>
+        <w:t xml:space="preserve"> devices found!"</w:t>
       </w:r>
     </w:p>
     <w:p>
@@ -529,7 +627,15 @@
         <w:pStyle w:val="Code"/>
       </w:pPr>
       <w:r>
-        <w:t>IF (devices.Count = 1)</w:t>
+        <w:t>IF (</w:t>
+      </w:r>
+      <w:proofErr w:type="spellStart"/>
+      <w:r>
+        <w:t>devices.Count</w:t>
+      </w:r>
+      <w:proofErr w:type="spellEnd"/>
+      <w:r>
+        <w:t xml:space="preserve"> = 1)</w:t>
       </w:r>
     </w:p>
     <w:p>
@@ -553,15 +659,39 @@
         <w:pStyle w:val="Code"/>
       </w:pPr>
       <w:r>
-        <w:t xml:space="preserve">    device = Bluetooth.PickDevicesName ("Skoobot*")</w:t>
-      </w:r>
-    </w:p>
-    <w:p>
-      <w:pPr>
-        <w:pStyle w:val="Code"/>
-      </w:pPr>
-      <w:r>
-        <w:t xml:space="preserve">    IF (device.IsError) THEN</w:t>
+        <w:t xml:space="preserve">    device = </w:t>
+      </w:r>
+      <w:proofErr w:type="spellStart"/>
+      <w:r>
+        <w:t>Bluetooth.PickDevicesName</w:t>
+      </w:r>
+      <w:proofErr w:type="spellEnd"/>
+      <w:r>
+        <w:t xml:space="preserve"> ("</w:t>
+      </w:r>
+      <w:proofErr w:type="spellStart"/>
+      <w:r>
+        <w:t>Skoobot</w:t>
+      </w:r>
+      <w:proofErr w:type="spellEnd"/>
+      <w:r>
+        <w:t>*")</w:t>
+      </w:r>
+    </w:p>
+    <w:p>
+      <w:pPr>
+        <w:pStyle w:val="Code"/>
+      </w:pPr>
+      <w:r>
+        <w:t xml:space="preserve">    IF (</w:t>
+      </w:r>
+      <w:proofErr w:type="spellStart"/>
+      <w:r>
+        <w:t>device.IsError</w:t>
+      </w:r>
+      <w:proofErr w:type="spellEnd"/>
+      <w:r>
+        <w:t>) THEN</w:t>
       </w:r>
     </w:p>
     <w:p>
@@ -600,8 +730,29 @@
       <w:pPr>
         <w:pStyle w:val="Code"/>
       </w:pPr>
-      <w:r>
-        <w:t>skoobot = device.As ("Skoobot")</w:t>
+      <w:proofErr w:type="spellStart"/>
+      <w:r>
+        <w:t>skoobot</w:t>
+      </w:r>
+      <w:proofErr w:type="spellEnd"/>
+      <w:r>
+        <w:t xml:space="preserve"> = </w:t>
+      </w:r>
+      <w:proofErr w:type="spellStart"/>
+      <w:r>
+        <w:t>device.As</w:t>
+      </w:r>
+      <w:proofErr w:type="spellEnd"/>
+      <w:r>
+        <w:t xml:space="preserve"> ("</w:t>
+      </w:r>
+      <w:proofErr w:type="spellStart"/>
+      <w:r>
+        <w:t>Skoobot</w:t>
+      </w:r>
+      <w:proofErr w:type="spellEnd"/>
+      <w:r>
+        <w:t>")</w:t>
       </w:r>
     </w:p>
     <w:p>
@@ -622,47 +773,96 @@
         <w:pStyle w:val="Code"/>
       </w:pPr>
       <w:r>
-        <w:t>DIM lightData()</w:t>
-      </w:r>
-    </w:p>
-    <w:p>
-      <w:pPr>
-        <w:pStyle w:val="Code"/>
-      </w:pPr>
-      <w:r>
-        <w:t>lightData.MaxCount = 50</w:t>
-      </w:r>
-    </w:p>
-    <w:p>
-      <w:pPr>
-        <w:pStyle w:val="Code"/>
-      </w:pPr>
-      <w:r>
-        <w:t>lightData.RemoveAlgorithm = “First”</w:t>
-      </w:r>
-    </w:p>
-    <w:p>
-      <w:pPr>
-        <w:pStyle w:val="Code"/>
-      </w:pPr>
-      <w:r>
-        <w:t>gl = Screen.Graphics (50, 50, 100, 400)</w:t>
-      </w:r>
-    </w:p>
-    <w:p>
-      <w:pPr>
-        <w:pStyle w:val="Code"/>
-      </w:pPr>
-      <w:r>
-        <w:t>gl.Title = "Ambient Light (lux)"</w:t>
-      </w:r>
-    </w:p>
-    <w:p>
-      <w:pPr>
-        <w:pStyle w:val="Code"/>
-      </w:pPr>
-      <w:r>
-        <w:t>gl.GraphY (lightData)</w:t>
+        <w:t xml:space="preserve">DIM </w:t>
+      </w:r>
+      <w:proofErr w:type="spellStart"/>
+      <w:r>
+        <w:t>lightData</w:t>
+      </w:r>
+      <w:proofErr w:type="spellEnd"/>
+      <w:r>
+        <w:t>()</w:t>
+      </w:r>
+    </w:p>
+    <w:p>
+      <w:pPr>
+        <w:pStyle w:val="Code"/>
+      </w:pPr>
+      <w:proofErr w:type="spellStart"/>
+      <w:r>
+        <w:t>lightData.MaxCount</w:t>
+      </w:r>
+      <w:proofErr w:type="spellEnd"/>
+      <w:r>
+        <w:t xml:space="preserve"> = 50</w:t>
+      </w:r>
+    </w:p>
+    <w:p>
+      <w:pPr>
+        <w:pStyle w:val="Code"/>
+      </w:pPr>
+      <w:proofErr w:type="spellStart"/>
+      <w:r>
+        <w:t>lightData.RemoveAlgorithm</w:t>
+      </w:r>
+      <w:proofErr w:type="spellEnd"/>
+      <w:r>
+        <w:t xml:space="preserve"> = “First”</w:t>
+      </w:r>
+    </w:p>
+    <w:p>
+      <w:pPr>
+        <w:pStyle w:val="Code"/>
+      </w:pPr>
+      <w:proofErr w:type="spellStart"/>
+      <w:r>
+        <w:t>gl</w:t>
+      </w:r>
+      <w:proofErr w:type="spellEnd"/>
+      <w:r>
+        <w:t xml:space="preserve"> = </w:t>
+      </w:r>
+      <w:proofErr w:type="spellStart"/>
+      <w:r>
+        <w:t>Screen.Graphics</w:t>
+      </w:r>
+      <w:proofErr w:type="spellEnd"/>
+      <w:r>
+        <w:t xml:space="preserve"> (50, 50, 100, 400)</w:t>
+      </w:r>
+    </w:p>
+    <w:p>
+      <w:pPr>
+        <w:pStyle w:val="Code"/>
+      </w:pPr>
+      <w:proofErr w:type="spellStart"/>
+      <w:r>
+        <w:t>gl.Title</w:t>
+      </w:r>
+      <w:proofErr w:type="spellEnd"/>
+      <w:r>
+        <w:t xml:space="preserve"> = "Ambient Light (lux)"</w:t>
+      </w:r>
+    </w:p>
+    <w:p>
+      <w:pPr>
+        <w:pStyle w:val="Code"/>
+      </w:pPr>
+      <w:proofErr w:type="spellStart"/>
+      <w:r>
+        <w:t>gl.GraphY</w:t>
+      </w:r>
+      <w:proofErr w:type="spellEnd"/>
+      <w:r>
+        <w:t xml:space="preserve"> (</w:t>
+      </w:r>
+      <w:proofErr w:type="spellStart"/>
+      <w:r>
+        <w:t>lightData</w:t>
+      </w:r>
+      <w:proofErr w:type="spellEnd"/>
+      <w:r>
+        <w:t>)</w:t>
       </w:r>
     </w:p>
     <w:p>
@@ -683,47 +883,96 @@
         <w:pStyle w:val="Code"/>
       </w:pPr>
       <w:r>
-        <w:t>DIM distanceData()</w:t>
-      </w:r>
-    </w:p>
-    <w:p>
-      <w:pPr>
-        <w:pStyle w:val="Code"/>
-      </w:pPr>
-      <w:r>
-        <w:t>distanceData.MaxCount = 50</w:t>
-      </w:r>
-    </w:p>
-    <w:p>
-      <w:pPr>
-        <w:pStyle w:val="Code"/>
-      </w:pPr>
-      <w:r>
-        <w:t>distanceData.RemoveAlgorithm = “First”</w:t>
-      </w:r>
-    </w:p>
-    <w:p>
-      <w:pPr>
-        <w:pStyle w:val="Code"/>
-      </w:pPr>
-      <w:r>
-        <w:t>gd = Screen.Graphics (50, 180, 100, 400)</w:t>
-      </w:r>
-    </w:p>
-    <w:p>
-      <w:pPr>
-        <w:pStyle w:val="Code"/>
-      </w:pPr>
-      <w:r>
-        <w:t>gd.Title = "Distance (cm)"</w:t>
-      </w:r>
-    </w:p>
-    <w:p>
-      <w:pPr>
-        <w:pStyle w:val="Code"/>
-      </w:pPr>
-      <w:r>
-        <w:t>gd.GraphY (distanceData)</w:t>
+        <w:t xml:space="preserve">DIM </w:t>
+      </w:r>
+      <w:proofErr w:type="spellStart"/>
+      <w:r>
+        <w:t>distanceData</w:t>
+      </w:r>
+      <w:proofErr w:type="spellEnd"/>
+      <w:r>
+        <w:t>()</w:t>
+      </w:r>
+    </w:p>
+    <w:p>
+      <w:pPr>
+        <w:pStyle w:val="Code"/>
+      </w:pPr>
+      <w:proofErr w:type="spellStart"/>
+      <w:r>
+        <w:t>distanceData.MaxCount</w:t>
+      </w:r>
+      <w:proofErr w:type="spellEnd"/>
+      <w:r>
+        <w:t xml:space="preserve"> = 50</w:t>
+      </w:r>
+    </w:p>
+    <w:p>
+      <w:pPr>
+        <w:pStyle w:val="Code"/>
+      </w:pPr>
+      <w:proofErr w:type="spellStart"/>
+      <w:r>
+        <w:t>distanceData.RemoveAlgorithm</w:t>
+      </w:r>
+      <w:proofErr w:type="spellEnd"/>
+      <w:r>
+        <w:t xml:space="preserve"> = “First”</w:t>
+      </w:r>
+    </w:p>
+    <w:p>
+      <w:pPr>
+        <w:pStyle w:val="Code"/>
+      </w:pPr>
+      <w:proofErr w:type="spellStart"/>
+      <w:r>
+        <w:t>gd</w:t>
+      </w:r>
+      <w:proofErr w:type="spellEnd"/>
+      <w:r>
+        <w:t xml:space="preserve"> = </w:t>
+      </w:r>
+      <w:proofErr w:type="spellStart"/>
+      <w:r>
+        <w:t>Screen.Graphics</w:t>
+      </w:r>
+      <w:proofErr w:type="spellEnd"/>
+      <w:r>
+        <w:t xml:space="preserve"> (50, 180, 100, 400)</w:t>
+      </w:r>
+    </w:p>
+    <w:p>
+      <w:pPr>
+        <w:pStyle w:val="Code"/>
+      </w:pPr>
+      <w:proofErr w:type="spellStart"/>
+      <w:r>
+        <w:t>gd.Title</w:t>
+      </w:r>
+      <w:proofErr w:type="spellEnd"/>
+      <w:r>
+        <w:t xml:space="preserve"> = "Distance (cm)"</w:t>
+      </w:r>
+    </w:p>
+    <w:p>
+      <w:pPr>
+        <w:pStyle w:val="Code"/>
+      </w:pPr>
+      <w:proofErr w:type="spellStart"/>
+      <w:r>
+        <w:t>gd.GraphY</w:t>
+      </w:r>
+      <w:proofErr w:type="spellEnd"/>
+      <w:r>
+        <w:t xml:space="preserve"> (</w:t>
+      </w:r>
+      <w:proofErr w:type="spellStart"/>
+      <w:r>
+        <w:t>distanceData</w:t>
+      </w:r>
+      <w:proofErr w:type="spellEnd"/>
+      <w:r>
+        <w:t>)</w:t>
       </w:r>
     </w:p>
     <w:p>
@@ -752,7 +1001,15 @@
         <w:pStyle w:val="Code"/>
       </w:pPr>
       <w:r>
-        <w:t>REM Each will be called back about every 100 milliseceonds.</w:t>
+        <w:t xml:space="preserve">REM Each will be called back about every 100 </w:t>
+      </w:r>
+      <w:proofErr w:type="spellStart"/>
+      <w:r>
+        <w:t>milliseceonds</w:t>
+      </w:r>
+      <w:proofErr w:type="spellEnd"/>
+      <w:r>
+        <w:t>.</w:t>
       </w:r>
     </w:p>
     <w:p>
@@ -767,24 +1024,55 @@
       <w:pPr>
         <w:pStyle w:val="Code"/>
       </w:pPr>
-      <w:r>
-        <w:t>skoobot = device.As (“Skoobot”)</w:t>
-      </w:r>
-    </w:p>
-    <w:p>
-      <w:pPr>
-        <w:pStyle w:val="Code"/>
-      </w:pPr>
-      <w:r>
-        <w:t>skoobot.SetupLight (“Light”, 100)</w:t>
-      </w:r>
-    </w:p>
-    <w:p>
-      <w:pPr>
-        <w:pStyle w:val="Code"/>
-      </w:pPr>
-      <w:r>
-        <w:t>skoobot.SetupDistance ("Distance", 100)</w:t>
+      <w:proofErr w:type="spellStart"/>
+      <w:r>
+        <w:t>skoobot</w:t>
+      </w:r>
+      <w:proofErr w:type="spellEnd"/>
+      <w:r>
+        <w:t xml:space="preserve"> = </w:t>
+      </w:r>
+      <w:proofErr w:type="spellStart"/>
+      <w:r>
+        <w:t>device.As</w:t>
+      </w:r>
+      <w:proofErr w:type="spellEnd"/>
+      <w:r>
+        <w:t xml:space="preserve"> (“</w:t>
+      </w:r>
+      <w:proofErr w:type="spellStart"/>
+      <w:r>
+        <w:t>Skoobot</w:t>
+      </w:r>
+      <w:proofErr w:type="spellEnd"/>
+      <w:r>
+        <w:t>”)</w:t>
+      </w:r>
+    </w:p>
+    <w:p>
+      <w:pPr>
+        <w:pStyle w:val="Code"/>
+      </w:pPr>
+      <w:proofErr w:type="spellStart"/>
+      <w:r>
+        <w:t>skoobot.SetupLight</w:t>
+      </w:r>
+      <w:proofErr w:type="spellEnd"/>
+      <w:r>
+        <w:t xml:space="preserve"> (“Light”, 100)</w:t>
+      </w:r>
+    </w:p>
+    <w:p>
+      <w:pPr>
+        <w:pStyle w:val="Code"/>
+      </w:pPr>
+      <w:proofErr w:type="spellStart"/>
+      <w:r>
+        <w:t>skoobot.SetupDistance</w:t>
+      </w:r>
+      <w:proofErr w:type="spellEnd"/>
+      <w:r>
+        <w:t xml:space="preserve"> ("Distance", 100)</w:t>
       </w:r>
     </w:p>
     <w:p>
@@ -813,31 +1101,60 @@
         <w:pStyle w:val="Code"/>
       </w:pPr>
       <w:r>
-        <w:t>FUNCTION Light (currskoobot, lux)</w:t>
-      </w:r>
-    </w:p>
-    <w:p>
-      <w:pPr>
-        <w:pStyle w:val="Code"/>
-      </w:pPr>
-      <w:r>
-        <w:t xml:space="preserve">    GLOBAL lightData</w:t>
-      </w:r>
-    </w:p>
-    <w:p>
-      <w:pPr>
-        <w:pStyle w:val="Code"/>
-      </w:pPr>
-      <w:r>
-        <w:t xml:space="preserve">    lightData.Add (lux)</w:t>
-      </w:r>
-    </w:p>
-    <w:p>
-      <w:pPr>
-        <w:pStyle w:val="Code"/>
-      </w:pPr>
-      <w:r>
-        <w:t xml:space="preserve">    Screen.ClearLine (2)</w:t>
+        <w:t>FUNCTION Light (</w:t>
+      </w:r>
+      <w:proofErr w:type="spellStart"/>
+      <w:r>
+        <w:t>currskoobot</w:t>
+      </w:r>
+      <w:proofErr w:type="spellEnd"/>
+      <w:r>
+        <w:t>, lux)</w:t>
+      </w:r>
+    </w:p>
+    <w:p>
+      <w:pPr>
+        <w:pStyle w:val="Code"/>
+      </w:pPr>
+      <w:r>
+        <w:t xml:space="preserve">    GLOBAL </w:t>
+      </w:r>
+      <w:proofErr w:type="spellStart"/>
+      <w:r>
+        <w:t>lightData</w:t>
+      </w:r>
+      <w:proofErr w:type="spellEnd"/>
+    </w:p>
+    <w:p>
+      <w:pPr>
+        <w:pStyle w:val="Code"/>
+      </w:pPr>
+      <w:r>
+        <w:t xml:space="preserve">    </w:t>
+      </w:r>
+      <w:proofErr w:type="spellStart"/>
+      <w:r>
+        <w:t>lightData.Add</w:t>
+      </w:r>
+      <w:proofErr w:type="spellEnd"/>
+      <w:r>
+        <w:t xml:space="preserve"> (lux)</w:t>
+      </w:r>
+    </w:p>
+    <w:p>
+      <w:pPr>
+        <w:pStyle w:val="Code"/>
+      </w:pPr>
+      <w:r>
+        <w:t xml:space="preserve">    </w:t>
+      </w:r>
+      <w:proofErr w:type="spellStart"/>
+      <w:r>
+        <w:t>Screen.ClearLine</w:t>
+      </w:r>
+      <w:proofErr w:type="spellEnd"/>
+      <w:r>
+        <w:t xml:space="preserve"> (2)</w:t>
       </w:r>
     </w:p>
     <w:p>
@@ -874,31 +1191,60 @@
         <w:pStyle w:val="Code"/>
       </w:pPr>
       <w:r>
-        <w:t>FUNCTION Distance (currskoobot, cm)</w:t>
-      </w:r>
-    </w:p>
-    <w:p>
-      <w:pPr>
-        <w:pStyle w:val="Code"/>
-      </w:pPr>
-      <w:r>
-        <w:t xml:space="preserve">    GLOBAL distanceData</w:t>
-      </w:r>
-    </w:p>
-    <w:p>
-      <w:pPr>
-        <w:pStyle w:val="Code"/>
-      </w:pPr>
-      <w:r>
-        <w:t xml:space="preserve">    distanceData.Add (cm)</w:t>
-      </w:r>
-    </w:p>
-    <w:p>
-      <w:pPr>
-        <w:pStyle w:val="Code"/>
-      </w:pPr>
-      <w:r>
-        <w:t xml:space="preserve">    Screen.ClearLine (3)</w:t>
+        <w:t>FUNCTION Distance (</w:t>
+      </w:r>
+      <w:proofErr w:type="spellStart"/>
+      <w:r>
+        <w:t>currskoobot</w:t>
+      </w:r>
+      <w:proofErr w:type="spellEnd"/>
+      <w:r>
+        <w:t>, cm)</w:t>
+      </w:r>
+    </w:p>
+    <w:p>
+      <w:pPr>
+        <w:pStyle w:val="Code"/>
+      </w:pPr>
+      <w:r>
+        <w:t xml:space="preserve">    GLOBAL </w:t>
+      </w:r>
+      <w:proofErr w:type="spellStart"/>
+      <w:r>
+        <w:t>distanceData</w:t>
+      </w:r>
+      <w:proofErr w:type="spellEnd"/>
+    </w:p>
+    <w:p>
+      <w:pPr>
+        <w:pStyle w:val="Code"/>
+      </w:pPr>
+      <w:r>
+        <w:t xml:space="preserve">    </w:t>
+      </w:r>
+      <w:proofErr w:type="spellStart"/>
+      <w:r>
+        <w:t>distanceData.Add</w:t>
+      </w:r>
+      <w:proofErr w:type="spellEnd"/>
+      <w:r>
+        <w:t xml:space="preserve"> (cm)</w:t>
+      </w:r>
+    </w:p>
+    <w:p>
+      <w:pPr>
+        <w:pStyle w:val="Code"/>
+      </w:pPr>
+      <w:r>
+        <w:t xml:space="preserve">    </w:t>
+      </w:r>
+      <w:proofErr w:type="spellStart"/>
+      <w:r>
+        <w:t>Screen.ClearLine</w:t>
+      </w:r>
+      <w:proofErr w:type="spellEnd"/>
+      <w:r>
+        <w:t xml:space="preserve"> (3)</w:t>
       </w:r>
     </w:p>
     <w:p>
@@ -921,7 +1267,15 @@
     <w:p/>
     <w:p>
       <w:r>
-        <w:t>There are complete Skoobot sample programs including</w:t>
+        <w:t xml:space="preserve">There are complete </w:t>
+      </w:r>
+      <w:proofErr w:type="spellStart"/>
+      <w:r>
+        <w:t>Skoobot</w:t>
+      </w:r>
+      <w:proofErr w:type="spellEnd"/>
+      <w:r>
+        <w:t xml:space="preserve"> sample programs including</w:t>
       </w:r>
     </w:p>
     <w:p>
@@ -932,7 +1286,31 @@
         <w:t>“A first control program</w:t>
       </w:r>
       <w:r>
-        <w:t>” which is the simplest possible real Skoobot program. It demonstrates how to connect to a Skoobot and to get a Skoobot specialization.</w:t>
+        <w:t xml:space="preserve">” which is the simplest possible real </w:t>
+      </w:r>
+      <w:proofErr w:type="spellStart"/>
+      <w:r>
+        <w:t>Skoobot</w:t>
+      </w:r>
+      <w:proofErr w:type="spellEnd"/>
+      <w:r>
+        <w:t xml:space="preserve"> program. It demonstrates how to connect to a </w:t>
+      </w:r>
+      <w:proofErr w:type="spellStart"/>
+      <w:r>
+        <w:t>Skoobot</w:t>
+      </w:r>
+      <w:proofErr w:type="spellEnd"/>
+      <w:r>
+        <w:t xml:space="preserve"> and to get a </w:t>
+      </w:r>
+      <w:proofErr w:type="spellStart"/>
+      <w:r>
+        <w:t>Skoobot</w:t>
+      </w:r>
+      <w:proofErr w:type="spellEnd"/>
+      <w:r>
+        <w:t xml:space="preserve"> specialization.</w:t>
       </w:r>
     </w:p>
     <w:p>
@@ -940,21 +1318,65 @@
         <w:rPr>
           <w:b/>
         </w:rPr>
-        <w:t>“Control program for Skoobot”</w:t>
-      </w:r>
-      <w:r>
-        <w:t xml:space="preserve"> is a GUI control program</w:t>
-      </w:r>
-    </w:p>
-    <w:p>
+        <w:t xml:space="preserve">“Control program for </w:t>
+      </w:r>
+      <w:proofErr w:type="spellStart"/>
       <w:r>
         <w:rPr>
           <w:b/>
         </w:rPr>
-        <w:t>“Gopher-of-things for Skoobot”</w:t>
-      </w:r>
-      <w:r>
-        <w:t xml:space="preserve"> shows how to control the Skoobot over the internet using the Gopher protocol to a local gateway. The local gateway runs the Gopher-of-things program, connecting to the nearby Skoobot using Bluetooth and offering up a Gopher interface to any Gopher client over the internet.</w:t>
+        <w:t>Skoobot</w:t>
+      </w:r>
+      <w:proofErr w:type="spellEnd"/>
+      <w:r>
+        <w:rPr>
+          <w:b/>
+        </w:rPr>
+        <w:t>”</w:t>
+      </w:r>
+      <w:r>
+        <w:t xml:space="preserve"> is a GUI control program</w:t>
+      </w:r>
+    </w:p>
+    <w:p>
+      <w:r>
+        <w:rPr>
+          <w:b/>
+        </w:rPr>
+        <w:t xml:space="preserve">“Gopher-of-things for </w:t>
+      </w:r>
+      <w:proofErr w:type="spellStart"/>
+      <w:r>
+        <w:rPr>
+          <w:b/>
+        </w:rPr>
+        <w:t>Skoobot</w:t>
+      </w:r>
+      <w:proofErr w:type="spellEnd"/>
+      <w:r>
+        <w:rPr>
+          <w:b/>
+        </w:rPr>
+        <w:t>”</w:t>
+      </w:r>
+      <w:r>
+        <w:t xml:space="preserve"> shows how to control the </w:t>
+      </w:r>
+      <w:proofErr w:type="spellStart"/>
+      <w:r>
+        <w:t>Skoobot</w:t>
+      </w:r>
+      <w:proofErr w:type="spellEnd"/>
+      <w:r>
+        <w:t xml:space="preserve"> over the internet using the Gopher protocol to a local gateway. The local gateway runs the Gopher-of-things program, connecting to the nearby </w:t>
+      </w:r>
+      <w:proofErr w:type="spellStart"/>
+      <w:r>
+        <w:t>Skoobot</w:t>
+      </w:r>
+      <w:proofErr w:type="spellEnd"/>
+      <w:r>
+        <w:t xml:space="preserve"> using Bluetooth and offering up a Gopher interface to any Gopher client over the internet.</w:t>
       </w:r>
     </w:p>
     <w:p>
@@ -974,10 +1396,32 @@
         <w:rPr>
           <w:b/>
         </w:rPr>
-        <w:t>board-driven Skoobot program”</w:t>
-      </w:r>
-      <w:r>
-        <w:t xml:space="preserve"> is a command-line program for the Skoobot.</w:t>
+        <w:t xml:space="preserve">board-driven </w:t>
+      </w:r>
+      <w:proofErr w:type="spellStart"/>
+      <w:r>
+        <w:rPr>
+          <w:b/>
+        </w:rPr>
+        <w:t>Skoobot</w:t>
+      </w:r>
+      <w:proofErr w:type="spellEnd"/>
+      <w:r>
+        <w:rPr>
+          <w:b/>
+        </w:rPr>
+        <w:t xml:space="preserve"> program”</w:t>
+      </w:r>
+      <w:r>
+        <w:t xml:space="preserve"> is a command-line program for the </w:t>
+      </w:r>
+      <w:proofErr w:type="spellStart"/>
+      <w:r>
+        <w:t>Skoobot</w:t>
+      </w:r>
+      <w:proofErr w:type="spellEnd"/>
+      <w:r>
+        <w:t>.</w:t>
       </w:r>
     </w:p>
     <w:p>
@@ -988,7 +1432,15 @@
         <w:t>“Light and Distance”</w:t>
       </w:r>
       <w:r>
-        <w:t xml:space="preserve"> demonstrates getting just light and distance data straight from the Skoobot and graphing the results. BC BASIC is particularly good at making it really simple to make graphs that automatically update themselves.</w:t>
+        <w:t xml:space="preserve"> demonstrates getting just light and distance data straight from the </w:t>
+      </w:r>
+      <w:proofErr w:type="spellStart"/>
+      <w:r>
+        <w:t>Skoobot</w:t>
+      </w:r>
+      <w:proofErr w:type="spellEnd"/>
+      <w:r>
+        <w:t xml:space="preserve"> and graphing the results. BC BASIC is particularly good at making it really simple to make graphs that automatically update themselves.</w:t>
       </w:r>
     </w:p>
     <w:p>

</xml_diff>